<commit_message>
docs: aclarar que RCS no ejecuta acciones de publicacion
El paso de decision ahora indica que publicar, corregir o despublicar se realiza fuera de la app.

Regenera diagramas y manuales afectados.
</commit_message>
<xml_diff>
--- a/docs/versiones/descripcion_revisacatalogos_v1.5_2026-10-25.docx
+++ b/docs/versiones/descripcion_revisacatalogos_v1.5_2026-10-25.docx
@@ -2164,10 +2164,15 @@
         <w:rPr>
           <w:b/>
         </w:rPr>
-        <w:t>Decidir</w:t>
-      </w:r>
-      <w:r>
-        <w:t xml:space="preserve"> si se publica, corrige o despublica cada caso.</w:t>
+        <w:t>Usar la información para decidir</w:t>
+      </w:r>
+      <w:r>
+        <w:t xml:space="preserve"> si corresponde publicar, corregir o</w:t>
+      </w:r>
+    </w:p>
+    <w:p>
+      <w:r>
+        <w:t>despublicar. Esa acción se realiza fuera de RCS; la app solo entrega el análisis.</w:t>
       </w:r>
     </w:p>
     <w:p>
@@ -2191,7 +2196,7 @@
       <w:r>
         <w:drawing>
           <wp:inline xmlns:a="http://schemas.openxmlformats.org/drawingml/2006/main" xmlns:pic="http://schemas.openxmlformats.org/drawingml/2006/picture">
-            <wp:extent cx="5486400" cy="6251670"/>
+            <wp:extent cx="5486400" cy="5956370"/>
             <wp:docPr id="2" name="Picture 2"/>
             <wp:cNvGraphicFramePr>
               <a:graphicFrameLocks noChangeAspect="1"/>
@@ -2212,7 +2217,7 @@
                   <pic:spPr>
                     <a:xfrm>
                       <a:off x="0" y="0"/>
-                      <a:ext cx="5486400" cy="6251670"/>
+                      <a:ext cx="5486400" cy="5956370"/>
                     </a:xfrm>
                     <a:prstGeom prst="rect"/>
                   </pic:spPr>
@@ -3210,7 +3215,7 @@
       <w:r>
         <w:drawing>
           <wp:inline xmlns:a="http://schemas.openxmlformats.org/drawingml/2006/main" xmlns:pic="http://schemas.openxmlformats.org/drawingml/2006/picture">
-            <wp:extent cx="5486400" cy="3865055"/>
+            <wp:extent cx="5486400" cy="3670735"/>
             <wp:docPr id="8" name="Picture 8"/>
             <wp:cNvGraphicFramePr>
               <a:graphicFrameLocks noChangeAspect="1"/>
@@ -3231,7 +3236,7 @@
                   <pic:spPr>
                     <a:xfrm>
                       <a:off x="0" y="0"/>
-                      <a:ext cx="5486400" cy="3865055"/>
+                      <a:ext cx="5486400" cy="3670735"/>
                     </a:xfrm>
                     <a:prstGeom prst="rect"/>
                   </pic:spPr>

</xml_diff>